<commit_message>
docs(standards): the CISO summary's opening line promised one question and asked two
"Two pages on one question: ... so what do you require, and how do you tell
whether you got it?" announced a single question and then asked two, inside one
sentence carrying a colon, a comma splice and a trailing clause.

Now two short sentences: the situation, then what the document does about it.
"Your engineers are building with AI assistants. Two pages on what to require,
and how to tell whether you actually got it." Same content, same length signal,
readable at a glance -- which is the whole premise of a summary aimed at someone
who will skim it once.

Word copy regenerated. Verified: check-ascii clean, all seven test files pass.
</commit_message>
<xml_diff>
--- a/docs/standards/word/CISO-SUMMARY.docx
+++ b/docs/standards/word/CISO-SUMMARY.docx
@@ -20,7 +20,7 @@
           <w:b/>
           <w:bCs/>
         </w:rPr>
-        <w:t xml:space="preserve">Two pages on one question: your engineers are building with AI assistants, so what do you</w:t>
+        <w:t xml:space="preserve">Your engineers are building with AI assistants. Two pages on what to require, and how to tell</w:t>
       </w:r>
       <w:r>
         <w:rPr>
@@ -34,7 +34,7 @@
           <w:b/>
           <w:bCs/>
         </w:rPr>
-        <w:t xml:space="preserve">require, and how do you tell whether you got it?</w:t>
+        <w:t xml:space="preserve">whether you actually got it.</w:t>
       </w:r>
     </w:p>
     <w:p>

</xml_diff>

<commit_message>
docs(standards): name both documents written for people, not one
The overview said the CISO summary was the exception to the hand-it-to-a-tool
advice. Two documents are: the CISO summary and Human review of code. The second
had its agent-facing block removed earlier today precisely because it is written
to be read, so the overview was one edit behind.

Both are now named and linked at the point the advice is given.

The CISO summary's own opening carried the same stale claim from the other side
-- "the standards behind it are different" implied all of them are agent-facing.
It now says this one is written to be read, so is Human review of code, and the
others are different. Two places, one fact, and they agree.

OVERVIEW.docx and CISO-SUMMARY.docx regenerated. Verified: check-ascii clean, 35
tests pass.
</commit_message>
<xml_diff>
--- a/docs/standards/word/CISO-SUMMARY.docx
+++ b/docs/standards/word/CISO-SUMMARY.docx
@@ -46,31 +46,39 @@
           <w:b/>
           <w:bCs/>
         </w:rPr>
-        <w:t xml:space="preserve">Meant to be worked with, not read straight through.</w:t>
-      </w:r>
-      <w:r>
-        <w:t xml:space="preserve"> </w:t>
-      </w:r>
-      <w:r>
-        <w:t xml:space="preserve">This summary is written to be read. The</w:t>
-      </w:r>
-      <w:r>
-        <w:t xml:space="preserve"> </w:t>
-      </w:r>
-      <w:r>
-        <w:t xml:space="preserve">standards behind it are different: most of their content is a base for</w:t>
-      </w:r>
-      <w:r>
-        <w:t xml:space="preserve"> </w:t>
-      </w:r>
-      <w:r>
-        <w:t xml:space="preserve">Claude Code, or another AI-assisted coding tool, to apply to a repository. That is how your</w:t>
-      </w:r>
-      <w:r>
-        <w:t xml:space="preserve"> </w:t>
-      </w:r>
-      <w:r>
-        <w:t xml:space="preserve">teams should expect to use them.</w:t>
+        <w:t xml:space="preserve">This one is written to be read.</w:t>
+      </w:r>
+      <w:r>
+        <w:t xml:space="preserve"> </w:t>
+      </w:r>
+      <w:r>
+        <w:t xml:space="preserve">So is</w:t>
+      </w:r>
+      <w:r>
+        <w:t xml:space="preserve"> </w:t>
+      </w:r>
+      <w:hyperlink r:id="rId9">
+        <w:r>
+          <w:rPr>
+            <w:rStyle w:val="Hyperlink"/>
+          </w:rPr>
+          <w:t xml:space="preserve">Human review of code</w:t>
+        </w:r>
+      </w:hyperlink>
+      <w:r>
+        <w:t xml:space="preserve">. The other</w:t>
+      </w:r>
+      <w:r>
+        <w:t xml:space="preserve"> </w:t>
+      </w:r>
+      <w:r>
+        <w:t xml:space="preserve">standards are different: most of their content is a base for Claude Code, or another AI-assisted</w:t>
+      </w:r>
+      <w:r>
+        <w:t xml:space="preserve"> </w:t>
+      </w:r>
+      <w:r>
+        <w:t xml:space="preserve">coding tool, to apply to a repository, and that is how your teams should expect to use them.</w:t>
       </w:r>
     </w:p>
     <w:p>
@@ -83,7 +91,7 @@
       <w:r>
         <w:t xml:space="preserve"> </w:t>
       </w:r>
-      <w:hyperlink r:id="rId9">
+      <w:hyperlink r:id="rId10">
         <w:r>
           <w:rPr>
             <w:rStyle w:val="Hyperlink"/>
@@ -136,7 +144,7 @@
       <w:r>
         <w:t xml:space="preserve"> </w:t>
       </w:r>
-      <w:hyperlink r:id="rId10">
+      <w:hyperlink r:id="rId11">
         <w:r>
           <w:rPr>
             <w:rStyle w:val="Hyperlink"/>
@@ -150,7 +158,7 @@
       <w:r>
         <w:t xml:space="preserve"> </w:t>
       </w:r>
-      <w:hyperlink r:id="rId11">
+      <w:hyperlink r:id="rId12">
         <w:r>
           <w:rPr>
             <w:rStyle w:val="Hyperlink"/>
@@ -169,7 +177,7 @@
         </w:pict>
       </w:r>
     </w:p>
-    <w:bookmarkStart w:id="12" w:name="the-bottom-line"/>
+    <w:bookmarkStart w:id="13" w:name="the-bottom-line"/>
     <w:p>
       <w:pPr>
         <w:pStyle w:val="Heading2"/>
@@ -310,8 +318,8 @@
         </w:pict>
       </w:r>
     </w:p>
-    <w:bookmarkEnd w:id="12"/>
-    <w:bookmarkStart w:id="13" w:name="Xcbf55e1dc656b3ccdb9dffda2f53baf834e09ac"/>
+    <w:bookmarkEnd w:id="13"/>
+    <w:bookmarkStart w:id="14" w:name="Xcbf55e1dc656b3ccdb9dffda2f53baf834e09ac"/>
     <w:p>
       <w:pPr>
         <w:pStyle w:val="Heading2"/>
@@ -539,8 +547,8 @@
         </w:pict>
       </w:r>
     </w:p>
-    <w:bookmarkEnd w:id="13"/>
-    <w:bookmarkStart w:id="14" w:name="X8b4b5e9e298a095c29b76446c0ae8f3da10e898"/>
+    <w:bookmarkEnd w:id="14"/>
+    <w:bookmarkStart w:id="15" w:name="X8b4b5e9e298a095c29b76446c0ae8f3da10e898"/>
     <w:p>
       <w:pPr>
         <w:pStyle w:val="Heading2"/>
@@ -821,8 +829,8 @@
         </w:pict>
       </w:r>
     </w:p>
-    <w:bookmarkEnd w:id="14"/>
-    <w:bookmarkStart w:id="15" w:name="what-to-fund-first"/>
+    <w:bookmarkEnd w:id="15"/>
+    <w:bookmarkStart w:id="16" w:name="what-to-fund-first"/>
     <w:p>
       <w:pPr>
         <w:pStyle w:val="Heading2"/>
@@ -930,8 +938,8 @@
         </w:pict>
       </w:r>
     </w:p>
-    <w:bookmarkEnd w:id="15"/>
-    <w:bookmarkStart w:id="16" w:name="what-this-is-not"/>
+    <w:bookmarkEnd w:id="16"/>
+    <w:bookmarkStart w:id="17" w:name="what-this-is-not"/>
     <w:p>
       <w:pPr>
         <w:pStyle w:val="Heading2"/>
@@ -1053,7 +1061,7 @@
         </w:pict>
       </w:r>
     </w:p>
-    <w:bookmarkEnd w:id="16"/>
+    <w:bookmarkEnd w:id="17"/>
     <w:bookmarkStart w:id="23" w:name="where-to-go-next"/>
     <w:p>
       <w:pPr>
@@ -1118,7 +1126,7 @@
             <w:pPr>
               <w:pStyle w:val="Compact"/>
             </w:pPr>
-            <w:hyperlink r:id="rId17">
+            <w:hyperlink r:id="rId18">
               <w:r>
                 <w:rPr>
                   <w:rStyle w:val="Hyperlink"/>
@@ -1147,7 +1155,7 @@
             <w:pPr>
               <w:pStyle w:val="Compact"/>
             </w:pPr>
-            <w:hyperlink r:id="rId18">
+            <w:hyperlink r:id="rId9">
               <w:r>
                 <w:rPr>
                   <w:rStyle w:val="Hyperlink"/>

</xml_diff>